<commit_message>
Parecer PT1225FL: jurisprudência administrativa verificada (secções 5.4 a 5.7)
Encerramento como medida de polícia (STA 0259/03, 041291, 047736; TCAN 01877/06, 01150/20, 00457/17, 00261/05; PGR 29/2020), única decisão que cita o art.º 3.º-G (TCAN 01571/22), audiência prévia e urgência (STA 040860, 0816/05, 0691/03, 0125/03; TCAS 12747/15; TCAN 03207/09), medidas provisórias (STA 034/23 Pleno, 0189/22), canis e demolição (TCAS 04784/09, 11916/03; STA 090/10, 0847/07; TRL 1692/2007, 4185/25) e caducidade do art.º 128.º n.º 6 do CPA (STJ 76/17, TCAN 01247/20, TCAS 349/24, 211/22, 294/21). O verificador de travessões passa a ignorar as citações verbatim entre «».

Co-Authored-By: Claude Fable 5.1 <noreply@anthropic.com>
Claude-Session: https://claude.ai/code/session_01PZbJKiuBb33px8BvsUFSTo
</commit_message>
<xml_diff>
--- a/Encerramento PT1225FL Cantinho Soberano/Parecer_Encerramento_PT1225FL.docx
+++ b/Encerramento PT1225FL Cantinho Soberano/Parecer_Encerramento_PT1225FL.docx
@@ -2887,7 +2887,7 @@
           <w:i w:val="0"/>
           <w:sz w:val="22"/>
         </w:rPr>
-        <w:t>5.4 Jurisprudência administrativa: caducidade do procedimento oficioso</w:t>
+        <w:t>5.4 Jurisprudência administrativa: o encerramento como medida de polícia</w:t>
       </w:r>
     </w:p>
     <w:p>
@@ -2901,7 +2901,7 @@
           <w:i w:val="0"/>
           <w:sz w:val="22"/>
         </w:rPr>
-        <w:t>A base de dados dgsi.pt esteve inacessível a partir deste ambiente durante a consulta (erro 503), pelo que só se citam decisões lidas no espelho jurisprudencia.pt. Não foi possível verificar o texto de duas decisões identificadas em pesquisa e potencialmente úteis: o acórdão do Supremo Tribunal Administrativo de 18.3.2003, processo n.º 0259/03, citado como qualificando o encerramento provisório de estabelecimento como medida temporária e reversível, não sancionatória; e o acórdão do Tribunal Central Administrativo Sul de 2.6.2022, processo n.º 1391/21.5BELSB, citado sobre o ónus de demonstrar a urgência que dispensa a audiência prévia. Ambos devem ser confirmados no dgsi.pt antes de serem invocados.</w:t>
+        <w:t>Os tribunais administrativos qualificam o encerramento preventivo de estabelecimentos como medida de polícia administrativa, distinta da sanção com o mesmo nome. O Supremo Tribunal Administrativo, processo n.º 0259/03, 18.3.2003 (relator Rosendo José), tratou o encerramento de uma discoteca por falta de segurança contra incêndios como «medida provisória tomada logo na abertura do procedimento em que poderia ser aplicado o encerramento», e fixou que «A medida provisória é temporária, reversível, e destinada a evitar um dano que justificadamente se receia como iminente, não é uma medida sancionatória, ainda que exista uma sanção com a mesma designação de encerramento», podendo ser tomada «em qualquer estado ou fase do procedimento». O Tribunal Central Administrativo Norte, processo n.º 01877/06.1BEPRT, 28.6.2007, disse que a interdição de funcionamento «configura-se como uma medida administrativa independente e autónoma face ao processo contra-ordenacional que possa a vir a ser instaurado» e «distingue-se da sanção acessória de encerramento». O mesmo tribunal, processo n.º 01150/20.2BEBRG, 18.12.2020, acolheu a tese de que «o encerramento ali previsto representa uma medida de polícia administrativa e não uma pena», com apoio no Parecer n.º 19/2019 da Procuradoria-Geral da República.</w:t>
       </w:r>
     </w:p>
     <w:p>
@@ -2915,7 +2915,7 @@
           <w:i w:val="0"/>
           <w:sz w:val="22"/>
         </w:rPr>
-        <w:t>Sobre a caducidade do n.º 6 do art.º 128.º do CPA, o Supremo Tribunal de Justiça, em recurso contencioso de deliberação do Conselho Superior da Magistratura, processo n.º 76/17.1YFLSB, 16.5.2018 (relator Abrantes Geraldes, unanimidade), aplicou a norma na versão então vigente, de 180 dias, e fixou três pontos. O prazo é perentório e não «meramente ordenador»: «O decurso do prazo de 180 dias depois de iniciado sem que tenha sido produzida a deliberação [...] determina a caducidade do referido procedimento administrativo, ficando o CSM impedido de deliberar validamente em termos de afetar os direitos do concreto magistrado judicial.» A decisão tomada depois do prazo «É anulável». E o ato devido «traduzir-se-ia no arquivamento do procedimento administrativo com fundamento na sua caducidade». Quanto ao início do prazo, o Tribunal reconheceu que «Não é perfeitamente claro quando se iniciou tal procedimento administrativo» e contou-o a partir do primeiro ato dirigido ao visado de que havia prova nos autos. O acórdão não trata da contagem em dias úteis ou corridos.</w:t>
+        <w:t>O Conselho Consultivo da Procuradoria-Geral da República, Parecer n.º 29/2020, descreve as medidas de polícia como «fundamentalmente de carácter preventivo», dá como exemplos «o abate de gado por razões sanitárias, a demolição de obras clandestinas insuscetíveis de legalização [...] ou o encerramento de estabelecimentos ilegais», e acrescenta: «as medidas de polícia são adotadas enquanto perdurarem os seus pressupostos, sem outro condicionalismo temporal que não seja o da necessidade. São imprescritíveis. Ignoram a ilicitude do comportamento dos proprietários, não se encontram limitadas por presunções de inocência [...] De igual modo, nada impede que a sua adoção concorra com a aplicação de sanções penais ou administrativas.» No mesmo sentido, o Supremo Tribunal Administrativo, processo n.º 047736, 6.12.2001 (relator Vítor Gomes), admitiu que «A Administração pode servir-se, no exercício de determinada competência ou em determinado procedimento, de factos ou elementos de prova cujo conhecimento lhe advenha por via de outro procedimento», e que a medida de polícia não exige «um nexo de imputação subjectiva» ao responsável pelo estabelecimento.</w:t>
       </w:r>
     </w:p>
     <w:p>
@@ -2929,13 +2929,12 @@
           <w:i w:val="0"/>
           <w:sz w:val="22"/>
         </w:rPr>
-        <w:t>Em sentido diferente, mas para outro tipo de procedimento, o Tribunal da Relação do Porto, processo n.º 916/25.1T9MAI.P1, 16.3.2026 (relatora Paula Natércia Rocha), decidiu que a caducidade do n.º 6 do art.º 128.º não se aplica aos procedimentos contraordenacionais, regidos pelo regime geral das contraordenações e pelo Código de Processo Penal, cujo único limite temporal é a prescrição. Essa decisão não abrange o procedimento do art.º 3.º-G, que é administrativo e não contraordenacional.</w:t>
+        <w:t>Sobre a proporcionalidade na escolha da medida, o Tribunal Central Administrativo Norte, processo n.º 00261/05.9BEPRT, 26.4.2007 (relatora Ana Paula Portela), decidiu que «Não viola o princípio da proporcionalidade a escolha da medida de encerramento de estabelecimento [...] relativamente às medidas de suspensão da actividade; encerramento parcial preventivo do estabelecimento; encerramento total preventivo do estabelecimento; apreensão parcial do equipamento e apreensão total do equipamento numa situação em que está em causa a salvaguarda da saúde pública e do ambiente, que eram atingidos de forma grave». O Pleno do Supremo Tribunal Administrativo, processo n.º 041291, 12.11.2003, manteve o encerramento compulsivo de uma escola profissional e afirmou que o direito de propriedade e de iniciativa «não são direitos absolutos, tendo de ser compatibilizados com o manifesto interesse público». O Tribunal Central Administrativo Norte, processo n.º 00457/17.0BECBR, 12.4.2019, sobre o encerramento urgente de uma estrutura residencial para idosos, escreveu: «só o facto do estabelecimento não possuir licença de funcionamento, tal determinaria o seu encerramento, sob pena de se sedimentar um clima de impunidade permissiva, sempre pernicioso.»</w:t>
       </w:r>
     </w:p>
     <w:p>
       <w:pPr>
-        <w:spacing w:before="0" w:after="160"/>
-        <w:ind w:left="340"/>
+        <w:spacing w:before="0" w:after="120"/>
         <w:jc w:val="both"/>
       </w:pPr>
       <w:r>
@@ -2944,7 +2943,204 @@
           <w:i w:val="0"/>
           <w:sz w:val="22"/>
         </w:rPr>
-        <w:t>Observação. A Lei n.º 72/2020, de 16 de novembro, reduziu o prazo de 180 para 120 dias. Não se encontrou decisão que diga se os 120 dias se contam em dias úteis. A leitura literal do art.º 87.º do CPA aponta para dias úteis, porque o prazo é inferior a seis meses (al. d)) e a regra geral é a suspensão aos sábados, domingos e feriados (al. c)). O caso do Conselho Superior da Magistratura mostra o risco: a Administração defendeu que o prazo era «meramente ordenador» e perdeu, com anulação do ato. A DGAV não deve contar com uma interpretação favorável. Deve decidir dentro do prazo contado da forma mais exigente que seja ainda defensável, ou reiniciar o procedimento.</w:t>
+        <w:t>A única decisão localizada que cita o art.º 3.º-G do Decreto-Lei n.º 276/2001 é a do Tribunal Central Administrativo Norte, processo n.º 01571/22.6BEPRT, 21.4.2023 (relator Ricardo de Oliveira e Sousa), sobre o encerramento definitivo, pelo ICNF, do alojamento de uma associação de proteção animal que funcionava sem comunicação prévia, com denúncias de falta de bem-estar e risco de incêndio, e a quem tinha sido proposta a entrega dos animais a outras instituições. A associação invocou a preterição da audiência prévia e a «ofensa do procedimento previsto no art. 3.º-G, n.ºs. 2, 3 e 4». O tribunal recusou a suspensão de eficácia: «se outros requisitos não se mostrassem incumpridos, só as circunstâncias de (i) laborar ilegitimamente [sem comunicação prévia] e (ii) desprovido de um sistema de proteção de incêndios, determinaria o “encerramento” do alojamento da Requerente, sob pena de se sedimentar um clima de impunidade permissiva contrário ao Estado de Direito», pelo que, ainda que os vícios existissem, a decisão «se apresentava à luz da lei e do interesse público como a única alternativa decisória, absolutamente inevitável e incapaz de ser influenciada pelo contributo da Recorrente». O Tribunal Central Administrativo Norte, processo n.º 00761/16.5BEBRG, 30.6.2023, julgou improcedente a impugnação de um ato da DGAV que determinou a retirada de animais de uma exploração por maus-tratos, contra o qual se invocava preterição de audiência, falta de fundamentação e erro nos pressupostos. Não se localizou qualquer acórdão que aprecie um despacho de encerramento ou suspensão de alojamento proferido pelo diretor-geral de Alimentação e Veterinária.</w:t>
+      </w:r>
+    </w:p>
+    <w:p>
+      <w:pPr>
+        <w:spacing w:before="0" w:after="160"/>
+        <w:ind w:left="340"/>
+        <w:jc w:val="both"/>
+      </w:pPr>
+      <w:r>
+        <w:rPr>
+          <w:b w:val="0"/>
+          <w:i w:val="0"/>
+          <w:sz w:val="22"/>
+        </w:rPr>
+        <w:t>Observação. Estes precedentes dão à DGAV duas seguranças e um aviso. As seguranças: a natureza preventiva do encerramento afasta a objeção de dupla punição e permite usar no procedimento os elementos recolhidos pela GNR no processo-crime; e um alojamento com Complexo B sem comunicação prévia e sem sistema de proteção contra incêndios, em zona florestal, está na situação que o TCAN considerou de encerramento inevitável. O aviso: o aproveitamento do ato com vícios de procedimento só funciona quando a decisão é a única possível. Como a escolha entre suspensão e encerramento é discricionária, a DGAV não deve contar com ele; deve cumprir a audiência e fundamentar a escolha.</w:t>
+      </w:r>
+    </w:p>
+    <w:p>
+      <w:pPr>
+        <w:spacing w:before="160" w:after="80"/>
+      </w:pPr>
+      <w:r>
+        <w:rPr>
+          <w:b/>
+          <w:i w:val="0"/>
+          <w:sz w:val="22"/>
+        </w:rPr>
+        <w:t>5.5 Audiência prévia, urgência e medidas provisórias</w:t>
+      </w:r>
+    </w:p>
+    <w:p>
+      <w:pPr>
+        <w:spacing w:before="0" w:after="120"/>
+        <w:jc w:val="both"/>
+      </w:pPr>
+      <w:r>
+        <w:rPr>
+          <w:b w:val="0"/>
+          <w:i w:val="0"/>
+          <w:sz w:val="22"/>
+        </w:rPr>
+        <w:t>A dispensa de audiência por urgência exige urgência objetiva e fundamentada. O Pleno do Supremo Tribunal Administrativo, processo n.º 040860, 17.5.2001, fixou que a dispensa «deve assentar num juízo devidamente fundamentado pela Administração, com a indicação dos factos que revelem não apenas essa urgência, como também que ela é tal que aniquila a possibilidade de realizar a audiência no prazo mínimo da lei». O mesmo tribunal, processo n.º 0816/05, 29.6.2006, definiu a urgência como situação «em que o factor tempo se apresente como elemento determinante e constitutivo e seja impossível ou, pelo menos, muito difícil, cumpri-la através da observância dos procedimentos normais». Em sentido favorável às medidas sanitárias, o processo n.º 0691/03, 24.3.2004, admitiu que a audiência «não tem lugar, independentemente de invocação de motivos pela Administração, quando a decisão seja urgente [...] o que sucede quando a situação factual que está explicita no acto administrativo revela objectivamente a urgência, como a medida de encerramento que preventivamente visa afastar riscos graves para a saúde pública por falta de condições de higiene de um estabelecimento». E o processo n.º 0125/03, 29.4.2003, sobre a remoção de felídeos de uma habitação por razões de salubridade, concluiu que «É urgente a decisão» e que «não há lugar a audiência dos interessados».</w:t>
+      </w:r>
+    </w:p>
+    <w:p>
+      <w:pPr>
+        <w:spacing w:before="0" w:after="120"/>
+        <w:jc w:val="both"/>
+      </w:pPr>
+      <w:r>
+        <w:rPr>
+          <w:b w:val="0"/>
+          <w:i w:val="0"/>
+          <w:sz w:val="22"/>
+        </w:rPr>
+        <w:t>Fora da urgência, a preterição da audiência anula o ato, salvo quando a decisão não podia ser outra, e o ónus dessa prova é da Administração: Tribunal Central Administrativo Sul, processo n.º 12747/15, 24.2.2016 («Ónus esse de alegação e de prova que recai sobre a Administração»); Tribunal Central Administrativo Norte, processo n.º 03207/09.1BEPRT, 26.10.2018 («a dispensa de audiência prévia tem de ser objecto de decisão expressa fundamentada»; o aproveitamento «só é invocável quando seja possível afirmar que a decisão tomada é a única concretamente possível [...] não bastando que se trate de acto vinculado»); e processo n.º 00248/02-Porto, 10.11.2005 («Não é admissível como justificação para o não cumprimento da audiência prévia a aproximação do fim do prazo para a prolação do acto»). O Supremo Tribunal Administrativo, processo n.º 046979, 13.2.2002, anulou o encerramento de um consultório por falta de audiência, porque «o encerramento não se impor com carácter de absoluta inevitabilidade».</w:t>
+      </w:r>
+    </w:p>
+    <w:p>
+      <w:pPr>
+        <w:spacing w:before="0" w:after="120"/>
+        <w:jc w:val="both"/>
+      </w:pPr>
+      <w:r>
+        <w:rPr>
+          <w:b w:val="0"/>
+          <w:i w:val="0"/>
+          <w:sz w:val="22"/>
+        </w:rPr>
+        <w:t>As medidas provisórias dispensam audiência por lei. O Pleno do Supremo Tribunal Administrativo, processo n.º 034/23.7BALSB, 21.3.2024 (relator Pedro Machete), tratou uma suspensão preventiva como «uma medida provisória em razão da sua natureza cautelar (não sancionatória)» e concluiu que a urgência «justifica, no respeitante à audiência prévia, a aplicação da lógica subjacente à dispensa ope legis da audiência dos interessados consagrada no artigo 89.º, n.º 2» do CPA, sendo a defesa assegurada «pelo dever de fundamentação do receio da produção de danos irreparáveis ou de difícil reparação [...] e da proporcionalidade da suspensão e, bem assim, da possibilidade de impugnação contenciosa». No mesmo processo, a 1.ª Secção, 6.7.2023, tinha dito que a medida «não carece de audiência prévia, mas a sua aplicação pressupõe a notificação prévia da decisão, devidamente fundamentada». O Supremo Tribunal Administrativo, processo n.º 0189/22.8BEFUN.SA1, 21.5.2026, aplicou o n.º 2 do art.º 89.º a providências especiais com natureza de medidas provisórias e lembrou que o n.º 2 do art.º 122.º «não exige que se forneça ao interessado o teor completo de todos os elementos do processo administrativo, mas apenas aqueles que se revelem indispensáveis à compreensão da proposta de decisão». O Tribunal Central Administrativo Norte, processo n.º 00074/21.0BECBR, 2.6.2021, aplicou a caducidade da al. d) do art.º 90.º a uma medida provisória sem decisão final nos 180 dias seguintes à instauração.</w:t>
+      </w:r>
+    </w:p>
+    <w:p>
+      <w:pPr>
+        <w:spacing w:before="0" w:after="160"/>
+        <w:ind w:left="340"/>
+        <w:jc w:val="both"/>
+      </w:pPr>
+      <w:r>
+        <w:rPr>
+          <w:b w:val="0"/>
+          <w:i w:val="0"/>
+          <w:sz w:val="22"/>
+        </w:rPr>
+        <w:t>Observação. A jurisprudência confirma as duas recomendações do parecer. Em junho a urgência era objetiva e a DGAV podia ter decidido sem audiência, como no caso dos felídeos de 2003 ou do restaurante de 2004. Em outubro, com os animais retirados, a urgência deixou de aniquilar a possibilidade de ouvir a titular em dez dias úteis, e uma dispensa seria difícil de defender. A medida provisória do art.º 89.º, fundamentada e com prazo, é a via que os tribunais aceitam sem audiência.</w:t>
+      </w:r>
+    </w:p>
+    <w:p>
+      <w:pPr>
+        <w:spacing w:before="160" w:after="80"/>
+      </w:pPr>
+      <w:r>
+        <w:rPr>
+          <w:b/>
+          <w:i w:val="0"/>
+          <w:sz w:val="22"/>
+        </w:rPr>
+        <w:t>5.6 Canis, limites de detenção e demolição</w:t>
+      </w:r>
+    </w:p>
+    <w:p>
+      <w:pPr>
+        <w:spacing w:before="0" w:after="120"/>
+        <w:jc w:val="both"/>
+      </w:pPr>
+      <w:r>
+        <w:rPr>
+          <w:b w:val="0"/>
+          <w:i w:val="0"/>
+          <w:sz w:val="22"/>
+        </w:rPr>
+        <w:t>Sobre a detenção de cães fora do regime de alojamento, o Tribunal Central Administrativo Sul, processo n.º 04784/09, 4.2.2010 (relator Rui Pereira), anulou uma ordem municipal de remoção de todos os animais acima de seis, porque, em prédio rústico ou misto, «incumbe à Administração aferir sempre se o prédio [...] permite ou não o enquadramento na situação especial» do n.º 4 do art.º 3.º do Decreto-Lei n.º 314/2003; a omissão dessa apreciação é «erro sobre os respectivos pressupostos de facto e de direito». O mesmo tribunal, processo n.º 11916/03, 5.6.2003, recusou suspender a remoção de canídeos acima de três de uma residência, por «grave lesão do interesse público» na tranquilidade, saúde e segurança dos moradores. No foro civil, o Tribunal da Relação de Lisboa, processo n.º 1692/2007-8, 28.6.2007, deferiu a providência de remoção de 30 cães de um canil clandestino em logradouro urbano, por violação do n.º 1 do art.º 3.º do Decreto-Lei n.º 314/2003; e o processo n.º 4185/25.5T8SNT.L1-8, 6.11.2025, trata de um canil em Sintra com comunicação prévia ao abrigo do art.º 3.º-A do Decreto-Lei n.º 276/2001, demolição parcial das instalações e processo municipal pela ilegalidade da atividade. O Supremo Tribunal Administrativo, processo n.º 0847/07, 24.4.2008, responsabilizou um município que, «sabendo da existência de um estábulo a funcionar ilegalmente e tendo deliberado encerrá-lo, nada faz permitindo a continuação desse funcionamento ilegal e a produção dos prejuízos que lhe estão associados».</w:t>
+      </w:r>
+    </w:p>
+    <w:p>
+      <w:pPr>
+        <w:spacing w:before="0" w:after="120"/>
+        <w:jc w:val="both"/>
+      </w:pPr>
+      <w:r>
+        <w:rPr>
+          <w:b w:val="0"/>
+          <w:i w:val="0"/>
+          <w:sz w:val="22"/>
+        </w:rPr>
+        <w:t>Sobre a ordem de demolição, o Supremo Tribunal Administrativo, processo n.º 090/10, 24.3.2011 (relator Costa Reis), fixou que o art.º 106.º do regime jurídico da urbanização e da edificação «pauta-se pelo princípio da proporcionalidade», que «A lei não autoriza que, em caso de obra ilegal, a medida mais radical e mais gravosa para o particular – a demolição – seja tomada sem precedência de uma avaliação, ainda que sumária, sobre a possibilidade de legalização», mas também que a demolição pode ser ordenada «sempre que constatar que o interessado, pela sua passividade, não irá contribuir para a reposição da legalidade ou que a irá mesmo dificultar». O Tribunal Central Administrativo Norte, processo n.º 02588/12.4BEPRT, 28.2.2020, anulou uma ordem de demolição sem juízo prévio sobre a legalização.</w:t>
+      </w:r>
+    </w:p>
+    <w:p>
+      <w:pPr>
+        <w:spacing w:before="0" w:after="160"/>
+        <w:ind w:left="340"/>
+        <w:jc w:val="both"/>
+      </w:pPr>
+      <w:r>
+        <w:rPr>
+          <w:b w:val="0"/>
+          <w:i w:val="0"/>
+          <w:sz w:val="22"/>
+        </w:rPr>
+        <w:t>Observação. Daqui resultam três cautelas para o caso. A DGAV não deve fundar o encerramento na ordem de demolição, porque esta pode ser revista se a titular pedir a legalização; deve usá-la só como facto que torna a correção impossível em curto prazo. Se ficarem animais com a titular, a Câmara tem de avaliar a dimensão do terreno antes de ordenar a remoção acima de seis animais, sob pena de erro nos pressupostos. E a inação depois de decidir o encerramento tem custo: o Estado responde pelos prejuízos de um estabelecimento ilegal que deliberou encerrar e deixou funcionar.</w:t>
+      </w:r>
+    </w:p>
+    <w:p>
+      <w:pPr>
+        <w:spacing w:before="160" w:after="80"/>
+      </w:pPr>
+      <w:r>
+        <w:rPr>
+          <w:b/>
+          <w:i w:val="0"/>
+          <w:sz w:val="22"/>
+        </w:rPr>
+        <w:t>5.7 Caducidade do procedimento oficioso (n.º 6 do art.º 128.º do CPA)</w:t>
+      </w:r>
+    </w:p>
+    <w:p>
+      <w:pPr>
+        <w:spacing w:before="0" w:after="120"/>
+        <w:jc w:val="both"/>
+      </w:pPr>
+      <w:r>
+        <w:rPr>
+          <w:b w:val="0"/>
+          <w:i w:val="0"/>
+          <w:sz w:val="22"/>
+        </w:rPr>
+        <w:t>O prazo foi reduzido de 180 para 120 dias pela Lei n.º 72/2020, de 16 de novembro, aplicável aos procedimentos iniciados após 1.12.2020. Os tribunais tratam-no como perentório. O Supremo Tribunal de Justiça, em recurso contencioso de deliberação do Conselho Superior da Magistratura, processo n.º 76/17.1YFLSB, 16.5.2018 (relator Abrantes Geraldes), rejeitou a tese de que o prazo «é meramente ordenador e tem uma natureza eminentemente programática»: «O decurso do prazo de 180 dias depois de iniciado sem que tenha sido produzida a deliberação [...] determina a caducidade do referido procedimento administrativo», a decisão posterior «É anulável», e o ato devido «traduzir-se-ia no arquivamento do procedimento administrativo com fundamento na sua caducidade», o que afasta o aproveitamento do n.º 5 do art.º 163.º. O Tribunal Central Administrativo Norte, processo n.º 01247/20.9BEPRT, 3.6.2026 (relatora Catarina Vasconcelos), confirmou que o prazo «opera ope legis, não sendo um prazo meramente ordenador e programático», que «a lei não prevê a suspensão do referido prazo», que o ato tardio «é o mesmo anulável por violação de tal norma» e que a Administração «possa iniciar novo procedimento tendo em vista a prática de novo ato». O Tribunal Central Administrativo Sul, processo n.º 294/21.8BECTB, 3.2.2022, sobre o cancelamento oficioso de um registo de alojamento local, aplicou a caducidade e admitiu a abertura de novos procedimentos com o mesmo objeto.</w:t>
+      </w:r>
+    </w:p>
+    <w:p>
+      <w:pPr>
+        <w:spacing w:before="0" w:after="120"/>
+        <w:jc w:val="both"/>
+      </w:pPr>
+      <w:r>
+        <w:rPr>
+          <w:b w:val="0"/>
+          <w:i w:val="0"/>
+          <w:sz w:val="22"/>
+        </w:rPr>
+        <w:t>Sobre a contagem, duas decisões aplicaram o art.º 87.º do CPA, isto é, dias úteis, sem que a questão fosse controvertida: a sentença confirmada no Tribunal Central Administrativo Norte, processo n.º 01247/20.9BEPRT, contou «mais de 180 dias - contados nos termos do artigo 87.º do CPA»; e a sentença transcrita no Tribunal Central Administrativo Sul, processo n.º 349/24.7BECTB-A, 13.3.2025, contou o prazo «de 120 dias úteis, nos termos do artigo 87.º do CPA», a partir da deliberação que abriu o procedimento. Não se encontrou decisão que conte o prazo em dias corridos. Sobre o início, o Tribunal Central Administrativo Sul, processo n.º 211/22.8BECTB, 26.10.2023, fixou-o na informação jurídica que mereceu despacho de concordância do órgão, e não na comunicação posterior ao interessado; o Supremo Tribunal de Justiça, no caso de 2018, contou-o do primeiro ato dirigido ao visado de que havia prova. As decisões ancoram a instauração no primeiro ato que abre o procedimento desfavorável, interno ou externo, e nenhuma a fixa na data de uma fiscalização.</w:t>
+      </w:r>
+    </w:p>
+    <w:p>
+      <w:pPr>
+        <w:spacing w:before="0" w:after="160"/>
+        <w:ind w:left="340"/>
+        <w:jc w:val="both"/>
+      </w:pPr>
+      <w:r>
+        <w:rPr>
+          <w:b w:val="0"/>
+          <w:i w:val="0"/>
+          <w:sz w:val="22"/>
+        </w:rPr>
+        <w:t>Observação. Para a DGAV, a leitura prudente é esta: o prazo conta-se em dias úteis, não se suspende, corre desde o primeiro despacho que abriu o processo P.9441/26 com vista ao encerramento, e a decisão fora do prazo é anulável sem possibilidade de aproveitamento. A DSAVRN deve dizer qual foi esse despacho e a sua data. Se foi a 22 ou 23.6.2026, o termo é 10 ou 11.12.2026. Se a decisão não puder ser proferida até lá, abre-se novo procedimento, o que a jurisprudência admite, com nova visita e nova audiência, mantendo a medida provisória.</w:t>
       </w:r>
     </w:p>
     <w:p>

</xml_diff>

<commit_message>
Parecer PT1225FL: data de instauração do procedimento (despacho da DSAVRN de 25.9.2026 como tese principal; 10.12.2026 como data prudente)
Co-Authored-By: Claude Fable 5.1 <noreply@anthropic.com>
Claude-Session: https://claude.ai/code/session_01PZbJKiuBb33px8BvsUFSTo
</commit_message>
<xml_diff>
--- a/Encerramento PT1225FL Cantinho Soberano/Parecer_Encerramento_PT1225FL.docx
+++ b/Encerramento PT1225FL Cantinho Soberano/Parecer_Encerramento_PT1225FL.docx
@@ -134,7 +134,7 @@
           <w:i w:val="0"/>
           <w:sz w:val="22"/>
         </w:rPr>
-        <w:t>5. Há um risco de prazo que a Informação não refere. O n.º 6 do art.º 128.º do CPA faz caducar, «na ausência de decisão, no prazo de 120 dias», os procedimentos de iniciativa oficiosa com efeitos desfavoráveis. Se o procedimento se considerar instaurado com a fiscalização de 22.6.2026, o prazo, contado em dias úteis, termina em 10.12.2026; contado em dias corridos, já teria terminado em 20.10.2026. A contagem em dias úteis é a que resulta da al. c) do art.º 87.º, mas a questão tem de ser tratada de frente: a DGAV deve fixar no processo a data da instauração, notificar a titular sem demora e decidir logo após a audiência. Se a decisão só puder ser tomada depois do termo do prazo, o procedimento deve ser formalmente reiniciado com base em nova visita de verificação.</w:t>
+        <w:t>5. Há um risco de prazo que a Informação não refere. O n.º 6 do art.º 128.º do CPA faz caducar, «na ausência de decisão, no prazo de 120 dias», os procedimentos de iniciativa oficiosa com efeitos desfavoráveis. A data de instauração é discutível. A fiscalização de 22.6.2026 é um ato de controlo que podia terminar de várias formas; o procedimento dirigido ao encerramento começa com a Informação de 11.9.2026 e com o despacho de concordância da Diretora de Serviços da DSAVRN de 25.9.2026, que adota o relatório com proposta de decisão do n.º 2 do art.º 3.º-G. A jurisprudência ancora a instauração nesse tipo de ato e nunca numa fiscalização. Contado em dias úteis (al. c) do art.º 87.º), o prazo termina em 10.12.2026 se a instauração for 22.6, em 5.3.2027 se for 11.9 e em 19.3.2027 se for 25.9. A DGAV deve fixar expressamente a data de 25.9.2026 no despacho que manda notificar para audiência prévia, confirmar que o despacho de 22.6 não ordenou já a instrução de processo com vista ao encerramento, e, por prudência, decidir antes de 10.12.2026. Se a decisão só puder ser tomada depois, a tese de 25.9 é a primeira linha de defesa e o reinício formal do procedimento, com nova visita, a segunda.</w:t>
       </w:r>
     </w:p>
     <w:p>
@@ -2000,7 +2000,7 @@
           <w:i w:val="0"/>
           <w:sz w:val="22"/>
         </w:rPr>
-        <w:t>O prazo de caducidade do n.º 6 do art.º 128.º do CPA é o ponto crítico. O procedimento de encerramento é de iniciativa oficiosa e desfavorável. Caduca «na ausência de decisão, no prazo de 120 dias». A norma não diz a partir de quando. A leitura mais segura é a da instauração do procedimento, que aqui coincide, no mínimo, com a abertura do processo P.9441/26 na sequência da fiscalização de 22.6.2026. A contagem faz-se em dias úteis, por aplicação da al. c) do art.º 87.º, porque o prazo é inferior a seis meses (al. d)). Com esta contagem, o prazo termina em 10.12.2026 (ou 11.12.2026, se a instauração for 23.6.2026). Se a contagem fosse em dias corridos, teria terminado em 20.10.2026.</w:t>
+        <w:t>O prazo de caducidade do n.º 6 do art.º 128.º do CPA é o ponto crítico. O procedimento de encerramento é de iniciativa oficiosa e desfavorável. Caduca «na ausência de decisão, no prazo de 120 dias». A norma não diz a partir de quando. A instauração é o primeiro ato que abre o procedimento dirigido à decisão desfavorável. Há três candidatos: a fiscalização de 22.6.2026, com a abertura do processo P.9441/26; a Informação n.º 125893/26, de 11.9.2026; e o despacho de concordância da Diretora de Serviços da DSAVRN, de 25.9.2026. A fiscalização é um ato de controlo do plano do art.º 67.º, que podia terminar em contraordenação, em participação criminal ou em nada; o procedimento de encerramento só existe quando a direção de serviços adota o relatório com proposta de decisão do n.º 2 do art.º 3.º-G, isto é, em 25.9.2026, com a Informação de 11.9 como posição intermédia. A tese de 22.6 só prevalece se o despacho que ordenou a fiscalização já tiver mandado instruir processo com vista à suspensão ou ao encerramento, o que deve ser confirmado no processo. A contagem faz-se em dias úteis, por aplicação da al. c) do art.º 87.º, porque o prazo é inferior a seis meses (al. d)). Os termos são 10.12.2026 (instauração em 22.6), 5.3.2027 (11.9) ou 19.3.2027 (25.9).</w:t>
       </w:r>
     </w:p>
     <w:p>
@@ -2015,7 +2015,7 @@
           <w:i w:val="0"/>
           <w:sz w:val="22"/>
         </w:rPr>
-        <w:t>Observação. A questão da contagem tem jurisprudência (ver secção 5). Independentemente dela, a conduta prudente é a mesma: fixar no processo a data da instauração; notificar a titular para audiência prévia na semana seguinte ao despacho; decidir nos dias seguintes ao termo do prazo de pronúncia; e, se a decisão não puder ser proferida até 10.12.2026, reiniciar formalmente o procedimento com nova visita de verificação, que documente o estado atual do local. A caducidade não impede a Administração de instaurar novo procedimento com os mesmos factos, mas obriga a repetir os atos, incluindo a audiência.</w:t>
+        <w:t>Observação. A questão tem jurisprudência (ver secção 5). A conduta prudente é esta: o despacho da Diretora-Geral que manda notificar para audiência prévia fixa expressamente a instauração em 25.9.2026 («procedimento de suspensão ou encerramento instaurado com o despacho de 25.9.2026, sobre a Informação n.º 125893/26»), o que dá à DGAV uma data formal que um tribunal terá de rebater; a titular é notificada na semana seguinte; a decisão sai nos dias seguintes ao termo do prazo de pronúncia e, por prudência, antes de 10.12.2026, data a partir da qual a tese de 22.6 poderia ser invocada. Se a decisão não puder ser proferida até lá, a tese de 25.9 é a primeira linha de defesa e o reinício formal do procedimento, com nova visita de verificação, a segunda. A caducidade não impede a Administração de instaurar novo procedimento com os mesmos factos, mas obriga a repetir os atos, incluindo a audiência.</w:t>
       </w:r>
     </w:p>
     <w:p>
@@ -3140,7 +3140,7 @@
           <w:i w:val="0"/>
           <w:sz w:val="22"/>
         </w:rPr>
-        <w:t>Observação. Para a DGAV, a leitura prudente é esta: o prazo conta-se em dias úteis, não se suspende, corre desde o primeiro despacho que abriu o processo P.9441/26 com vista ao encerramento, e a decisão fora do prazo é anulável sem possibilidade de aproveitamento. A DSAVRN deve dizer qual foi esse despacho e a sua data. Se foi a 22 ou 23.6.2026, o termo é 10 ou 11.12.2026. Se a decisão não puder ser proferida até lá, abre-se novo procedimento, o que a jurisprudência admite, com nova visita e nova audiência, mantendo a medida provisória.</w:t>
+        <w:t>Observação. Para a DGAV, a leitura prudente é esta: o prazo conta-se em dias úteis, não se suspende, e a decisão fora do prazo é anulável sem possibilidade de aproveitamento. A instauração é o primeiro ato que abre o procedimento dirigido ao encerramento, e a jurisprudência situa-o na informação com despacho de concordância ou na deliberação do órgão, nunca numa fiscalização: aqui, o despacho da Diretora de Serviços da DSAVRN de 25.9.2026 sobre a Informação de 11.9.2026 (termo em 19.3.2027), salvo se o despacho de 22.6.2026 já tiver mandado instruir processo com vista ao encerramento, caso em que o termo é 10.12.2026. A DGAV deve fixar a data de 25.9.2026 no despacho que manda notificar e, por prudência, decidir antes de 10.12.2026. Se a decisão não puder ser proferida até lá, a tese de 25.9 é a primeira linha de defesa; a segunda é abrir novo procedimento, o que a jurisprudência admite, com nova visita e nova audiência, mantendo a medida provisória.</w:t>
       </w:r>
     </w:p>
     <w:p>

</xml_diff>